<commit_message>
Release w5p with safer inputs and AI advice
Add shared preflight validation for keyed population and benchmark inputs and complete MFH panels before output cleanup, preserve raw UFH Direct uncertainty separately from model variances, and qualify standalone MFH inference. Default new or omitted variance settings to sm_all with matching rho_sm_all while preserving explicit saved choices; this can change estimates and uncertainty for newly configured runs. Add an optional aggregate-evidence UFH-versus-MFH recommendation to AI reports, and reorganize offline documentation, guides, validation records, and release materials.
</commit_message>
<xml_diff>
--- a/docs/guidance/Technical notes/Note on Estimating the Sampling-Error Covariance Matrix (revised).docx
+++ b/docs/guidance/Technical notes/Note on Estimating the Sampling-Error Covariance Matrix (revised).docx
@@ -540,7 +540,7 @@
         <w:pStyle w:val="Normal"/>
       </w:pPr>
       <w:r>
-        <w:t xml:space="preserve">QER implementation scope. This note concerns covariance of Direct sampling errors, not MCPE of model prediction errors. The latter and annual MSE are estimated jointly by the final-estimator bootstrap described in the companion MSE note. The implementation checks and simulation evidence are documented in docs/METHODOLOGY_ALIGNMENT.md and docs/MCPE_VALIDATION_STATUS.md. Numerical agreement and Monte Carlo precision do not certify interval coverage for all survey designs. Review model assumptions, boundary sensitivity and any undercoverage before dissemination. Use the latest validation status for current experiment counts and results.</w:t>
+        <w:t xml:space="preserve">QER implementation scope. This note concerns covariance of Direct sampling errors, not MCPE of model prediction errors. The latter and annual MSE are estimated jointly by the final-estimator bootstrap described in the companion MSE note. The implementation checks and simulation evidence are documented in docs/guidance/METHODOLOGY_ALIGNMENT.md and docs/validation/MCPE_VALIDATION_STATUS.md. Numerical agreement and Monte Carlo precision do not certify interval coverage for all survey designs. Review model assumptions, boundary sensitivity and any undercoverage before dissemination. Use the latest validation status for current experiment counts and results.</w:t>
       </w:r>
     </w:p>
     <w:p>
@@ -5184,94 +5184,94 @@
         <w:pStyle w:val="FirstParagraph"/>
       </w:pPr>
       <w:r>
-        <w:t xml:space="preserve">The EU SAE package operationalizes the two-year sampling-error covariance input in </w:t>
+        <w:t xml:space="preserve">The two-year covariance implementation in scripts/02_mfh.R uses survey::svydesign with ids = ~psu, optional supplied strata, and weights = ~population_weight. For household rows, population_weight = weight × household size; for person rows it equals weight alone. Domain covariance comes from the correctly specified joint survey design via svyby(..., covmat = TRUE) and vcov(). A national cross-time correlation can be combined with the chosen domain variances.</w:t>
       </w:r>
       <w:r>
         <w:rPr>
           <w:rStyle w:val="VerbatimChar"/>
         </w:rPr>
-        <w:t>scripts/02_mfh.R</w:t>
-      </w:r>
-      <w:r>
-        <w:t xml:space="preserve">. Direct estimates and sampling variances are computed using a </w:t>
+        <w:t xml:space="preserve"/>
+      </w:r>
+      <w:r>
+        <w:t xml:space="preserve"/>
       </w:r>
       <w:r>
         <w:rPr>
           <w:rStyle w:val="VerbatimChar"/>
         </w:rPr>
-        <w:t>survey</w:t>
-      </w:r>
-      <w:r>
-        <w:t xml:space="preserve"> design with </w:t>
+        <w:t xml:space="preserve"/>
+      </w:r>
+      <w:r>
+        <w:t xml:space="preserve"/>
       </w:r>
       <w:r>
         <w:rPr>
           <w:rStyle w:val="VerbatimChar"/>
         </w:rPr>
-        <w:t>ids = ~psu</w:t>
-      </w:r>
-      <w:r>
-        <w:t xml:space="preserve"> and </w:t>
+        <w:t xml:space="preserve"/>
+      </w:r>
+      <w:r>
+        <w:t xml:space="preserve"/>
       </w:r>
       <w:r>
         <w:rPr>
           <w:rStyle w:val="VerbatimChar"/>
         </w:rPr>
-        <w:t>weights = ~weight</w:t>
-      </w:r>
-      <w:r>
-        <w:t xml:space="preserve">. Domain-level covariance is obtained from </w:t>
+        <w:t xml:space="preserve"/>
+      </w:r>
+      <w:r>
+        <w:t xml:space="preserve"/>
       </w:r>
       <w:proofErr w:type="gramStart"/>
       <w:r>
         <w:rPr>
           <w:rStyle w:val="VerbatimChar"/>
         </w:rPr>
-        <w:t>svyby(</w:t>
+        <w:t xml:space="preserve"/>
       </w:r>
       <w:proofErr w:type="gramEnd"/>
       <w:r>
         <w:rPr>
           <w:rStyle w:val="VerbatimChar"/>
         </w:rPr>
-        <w:t>..., covmat = TRUE)</w:t>
-      </w:r>
-      <w:r>
-        <w:t xml:space="preserve"> and extracted with </w:t>
+        <w:t xml:space="preserve"/>
+      </w:r>
+      <w:r>
+        <w:t xml:space="preserve"/>
       </w:r>
       <w:proofErr w:type="gramStart"/>
       <w:r>
         <w:rPr>
           <w:rStyle w:val="VerbatimChar"/>
         </w:rPr>
-        <w:t>vcov(</w:t>
+        <w:t xml:space="preserve"/>
       </w:r>
       <w:proofErr w:type="gramEnd"/>
       <w:r>
         <w:rPr>
           <w:rStyle w:val="VerbatimChar"/>
         </w:rPr>
-        <w:t>)</w:t>
-      </w:r>
-      <w:r>
-        <w:t xml:space="preserve">. A national cross-time correlation is also computed from a national </w:t>
+        <w:t xml:space="preserve"/>
+      </w:r>
+      <w:r>
+        <w:t xml:space="preserve"/>
       </w:r>
       <w:proofErr w:type="gramStart"/>
       <w:r>
         <w:rPr>
           <w:rStyle w:val="VerbatimChar"/>
         </w:rPr>
-        <w:t>svyby(</w:t>
+        <w:t xml:space="preserve"/>
       </w:r>
       <w:proofErr w:type="gramEnd"/>
       <w:r>
         <w:rPr>
           <w:rStyle w:val="VerbatimChar"/>
         </w:rPr>
-        <w:t>..., covmat = TRUE)</w:t>
-      </w:r>
-      <w:r>
-        <w:t xml:space="preserve"> result and applied to domain-level variance choices.</w:t>
+        <w:t xml:space="preserve"/>
+      </w:r>
+      <w:r>
+        <w:t xml:space="preserve"/>
       </w:r>
     </w:p>
     <w:p>
@@ -6373,42 +6373,42 @@
         <w:pStyle w:val="FirstParagraph"/>
       </w:pPr>
       <w:r>
-        <w:t xml:space="preserve">The diagonal variances also scale the </w:t>
+        <w:t xml:space="preserve">The same variance concept must scale the diagonal and off-diagonal. direct keeps raw design variances subject to explicit missing/zero safety backfills. sm_all is the default and replaces all working variances with GVF predictions. Optional sm_out retains a finite direct variance at least 0.001 and replaces missing, nonfinite or strictly smaller values with GVF predictions; it does not replace large variances. This cutoff is an application policy requiring indicator/scale sensitivity checks. For log means it applies on the log-mean variance scale. Raw Direct uncertainty remains separate from these model inputs.</w:t>
       </w:r>
       <w:proofErr w:type="gramStart"/>
       <w:r>
-        <w:t>off-diagonal</w:t>
+        <w:t xml:space="preserve"/>
       </w:r>
       <w:proofErr w:type="gramEnd"/>
       <w:r>
-        <w:t xml:space="preserve">, so the same variance concept must be used in both places. The package builds these variances in three ways. The </w:t>
+        <w:t xml:space="preserve"/>
       </w:r>
       <w:r>
         <w:rPr>
           <w:rStyle w:val="VerbatimChar"/>
         </w:rPr>
-        <w:t>direct</w:t>
-      </w:r>
-      <w:r>
-        <w:t xml:space="preserve"> option keeps the raw design-based variances, backfilling only missing or zero values. The fully smoothed option (</w:t>
+        <w:t xml:space="preserve"/>
+      </w:r>
+      <w:r>
+        <w:t xml:space="preserve"/>
       </w:r>
       <w:r>
         <w:rPr>
           <w:rStyle w:val="VerbatimChar"/>
         </w:rPr>
-        <w:t>sm_all</w:t>
-      </w:r>
-      <w:r>
-        <w:t>) replaces every variance with a smoothed value. The outlier-smoothed option (</w:t>
+        <w:t xml:space="preserve"/>
+      </w:r>
+      <w:r>
+        <w:t xml:space="preserve"/>
       </w:r>
       <w:r>
         <w:rPr>
           <w:rStyle w:val="VerbatimChar"/>
         </w:rPr>
-        <w:t>sm_out</w:t>
-      </w:r>
-      <w:r>
-        <w:t>), which is the default, replaces only problematic variances (those near zero, or far above the smoothed value) and leaves the remaining direct variances unchanged.</w:t>
+        <w:t xml:space="preserve"/>
+      </w:r>
+      <w:r>
+        <w:t xml:space="preserve"/>
       </w:r>
     </w:p>
     <w:p>
@@ -6892,7 +6892,7 @@
         <w:t>rho_sm_out</w:t>
       </w:r>
       <w:r>
-        <w:t>: estimate a national cross-time correlation and apply it to outlier-smoothed domain variances.</w:t>
+        <w:t xml:space="preserve">: estimate a national cross-time correlation and apply it to selectively smoothed (sm_out) domain variances.</w:t>
       </w:r>
     </w:p>
     <w:p>
@@ -6977,16 +6977,16 @@
         </w:numPr>
       </w:pPr>
       <w:r>
-        <w:t xml:space="preserve">Use </w:t>
+        <w:t xml:space="preserve">Use rho_sm_all with sm_all as the default when sampling dependence is plausible and domain covariances are noisy; assess the GVF fit and covariance assumptions.</w:t>
       </w:r>
       <w:r>
         <w:rPr>
           <w:rStyle w:val="VerbatimChar"/>
         </w:rPr>
-        <w:t>rho_sm_out</w:t>
-      </w:r>
-      <w:r>
-        <w:t xml:space="preserve"> as the practical default when sample overlap is plausible but domain-level covariances are noisy.</w:t>
+        <w:t xml:space="preserve"/>
+      </w:r>
+      <w:r>
+        <w:t xml:space="preserve"/>
       </w:r>
     </w:p>
     <w:p>
@@ -6998,16 +6998,16 @@
         </w:numPr>
       </w:pPr>
       <w:r>
-        <w:t xml:space="preserve">Use </w:t>
+        <w:t xml:space="preserve">Use rho_sm_out with sm_out as an optional sensitivity. Its unchanged 0.001 cutoff is scale-specific and does not replace large variances.</w:t>
       </w:r>
       <w:r>
         <w:rPr>
           <w:rStyle w:val="VerbatimChar"/>
         </w:rPr>
-        <w:t>rho_sm_all</w:t>
-      </w:r>
-      <w:r>
-        <w:t xml:space="preserve"> when many domain-level variances are unstable.</w:t>
+        <w:t xml:space="preserve"/>
+      </w:r>
+      <w:r>
+        <w:t xml:space="preserve"/>
       </w:r>
     </w:p>
     <w:p>
@@ -7075,7 +7075,7 @@
         <w:t>rho_sm_out</w:t>
       </w:r>
       <w:r>
-        <w:t xml:space="preserve"> uses the national cross-time correlation with the outlier-smoothed diagonal variances, while </w:t>
+        <w:t xml:space="preserve"> uses the national cross-time correlation with the selectively smoothed (sm_out) diagonal variances, while </w:t>
       </w:r>
       <w:r>
         <w:rPr>
@@ -7100,88 +7100,88 @@
         <w:pStyle w:val="BodyText"/>
       </w:pPr>
       <w:r>
-        <w:t>In the dashboard these choices are linked automatically: selecting a variance option sets the matching covariance option (</w:t>
+        <w:t xml:space="preserve">The dashboard offers matching variance–covariance choices (sm_all with rho_sm_all, sm_out with rho_sm_out, and direct with rho_dir), with direct and zero covariance also available. New configurations default to sm_all with rho_sm_all. An omitted covariance setting is derived from the effective variance choice; explicit saved choices are preserved. UFH also honors the selected variance option with log mean welfare, on the log-mean variance scale. Arcsine UFH retains its separate effective-sample-size analytical variance, with a fallback to observed sample size when its estimated effective sample size is invalid.</w:t>
       </w:r>
       <w:r>
         <w:rPr>
           <w:rStyle w:val="VerbatimChar"/>
         </w:rPr>
-        <w:t>sm_out</w:t>
-      </w:r>
-      <w:r>
-        <w:t xml:space="preserve"> with </w:t>
+        <w:t xml:space="preserve"/>
+      </w:r>
+      <w:r>
+        <w:t xml:space="preserve"/>
       </w:r>
       <w:r>
         <w:rPr>
           <w:rStyle w:val="VerbatimChar"/>
         </w:rPr>
-        <w:t>rho_sm_out</w:t>
-      </w:r>
-      <w:r>
-        <w:t xml:space="preserve">, </w:t>
+        <w:t xml:space="preserve"/>
+      </w:r>
+      <w:r>
+        <w:t xml:space="preserve"/>
       </w:r>
       <w:r>
         <w:rPr>
           <w:rStyle w:val="VerbatimChar"/>
         </w:rPr>
-        <w:t>sm_all</w:t>
-      </w:r>
-      <w:r>
-        <w:t xml:space="preserve"> with </w:t>
+        <w:t xml:space="preserve"/>
+      </w:r>
+      <w:r>
+        <w:t xml:space="preserve"/>
       </w:r>
       <w:r>
         <w:rPr>
           <w:rStyle w:val="VerbatimChar"/>
         </w:rPr>
-        <w:t>rho_sm_all</w:t>
-      </w:r>
-      <w:r>
-        <w:t xml:space="preserve">, and </w:t>
+        <w:t xml:space="preserve"/>
+      </w:r>
+      <w:r>
+        <w:t xml:space="preserve"/>
       </w:r>
       <w:r>
         <w:rPr>
           <w:rStyle w:val="VerbatimChar"/>
         </w:rPr>
-        <w:t>direct</w:t>
-      </w:r>
-      <w:r>
-        <w:t xml:space="preserve"> with </w:t>
+        <w:t xml:space="preserve"/>
+      </w:r>
+      <w:r>
+        <w:t xml:space="preserve"/>
       </w:r>
       <w:r>
         <w:rPr>
           <w:rStyle w:val="VerbatimChar"/>
         </w:rPr>
-        <w:t>rho_dir</w:t>
-      </w:r>
-      <w:r>
-        <w:t xml:space="preserve">), with </w:t>
+        <w:t xml:space="preserve"/>
+      </w:r>
+      <w:r>
+        <w:t xml:space="preserve"/>
       </w:r>
       <w:r>
         <w:rPr>
           <w:rStyle w:val="VerbatimChar"/>
         </w:rPr>
-        <w:t>direct</w:t>
-      </w:r>
-      <w:r>
-        <w:t xml:space="preserve"> and </w:t>
+        <w:t xml:space="preserve"/>
+      </w:r>
+      <w:r>
+        <w:t xml:space="preserve"/>
       </w:r>
       <w:r>
         <w:rPr>
           <w:rStyle w:val="VerbatimChar"/>
         </w:rPr>
-        <w:t>zero</w:t>
-      </w:r>
-      <w:r>
-        <w:t xml:space="preserve"> also available throughout. The package default pairs the outlier-smoothed variances with </w:t>
+        <w:t xml:space="preserve"/>
+      </w:r>
+      <w:r>
+        <w:t xml:space="preserve"/>
       </w:r>
       <w:r>
         <w:rPr>
           <w:rStyle w:val="VerbatimChar"/>
         </w:rPr>
-        <w:t>rho_sm_out</w:t>
-      </w:r>
-      <w:r>
-        <w:t>.</w:t>
+        <w:t xml:space="preserve"/>
+      </w:r>
+      <w:r>
+        <w:t xml:space="preserve"/>
       </w:r>
     </w:p>
     <w:p>
@@ -7682,7 +7682,7 @@
         </w:numPr>
       </w:pPr>
       <w:r>
-        <w:t>Welfare is strongly clustered geographically, so the intra-PSU correlation is large rather than negligible. The main source of cross-time dependence is the shared PSU, not the few re-interviewed households, and a unit-level overlap correlation would miss most of it.</w:t>
+        <w:t xml:space="preserve">Welfare may be geographically clustered, making persistent PSU-level dependence plausible. Its magnitude and sign must be checked for the application using the joint design and population evolution. Shared PSUs can matter beyond re-interviewed households; a matched-unit correlation alone need not capture all relevant dependence. This is an application-specific expectation, not a universal large-correlation claim.</w:t>
       </w:r>
     </w:p>
     <w:p>
@@ -8806,7 +8806,7 @@
         <w:pStyle w:val="Normal"/>
       </w:pPr>
       <w:r>
-        <w:t xml:space="preserve">The illustrative R workflow is: construct population_weight = weight × household size; declare the supplied PSU and optional strata design with survey::svydesign; compute arithmetic Direct means or FGT indicators by domain and year with survey::svyby; obtain cross-year design covariance from the joint design; and apply the selected area-variance and correlation policy. The production implementation is scripts/02_mfh.R. For log means, transform only after arithmetic aggregation: variance V/mean² and covariance C/(mean1 × mean2). Validate the assembled covariance matrices once before fitting, retain the repaired matrices, and use those exact inputs for every bootstrap simulation and refit.</w:t>
+        <w:t xml:space="preserve">The illustrative R workflow is: construct population_weight = weight × household size for household rows, or population_weight = weight for person rows; declare the supplied PSU and optional strata design with survey::svydesign; compute arithmetic Direct means or FGT indicators by domain and year with survey::svyby; obtain cross-year design covariance from the joint design; and apply the selected area-variance and correlation policy. The production implementation is scripts/02_mfh.R. For log means, transform only after arithmetic aggregation: variance V/mean² and covariance C/(mean1 × mean2). Validate the assembled covariance matrices once before fitting, retain the repaired matrices, and use those exact inputs for every bootstrap simulation and refit.</w:t>
       </w:r>
     </w:p>
     <w:p>

</xml_diff>

<commit_message>
Add design-effect variance smoothing for MFH
Add an opt-in MFH smoothing mode that models design effects and rebuilds headcount variances using each domain’s rate and sample size. Validate the configuration, fall back to sample-size smoothing for unsupported indicators, and add coverage for smoothing behavior and edge cases.
</commit_message>
<xml_diff>
--- a/docs/guidance/Technical notes/Note on Estimating the Sampling-Error Covariance Matrix (revised).docx
+++ b/docs/guidance/Technical notes/Note on Estimating the Sampling-Error Covariance Matrix (revised).docx
@@ -6373,7 +6373,7 @@
         <w:pStyle w:val="FirstParagraph"/>
       </w:pPr>
       <w:r>
-        <w:t xml:space="preserve">The same variance concept must scale the diagonal and off-diagonal. direct keeps raw design variances subject to explicit missing/zero safety backfills. sm_all is the default and replaces all working variances with GVF predictions. Optional sm_out retains a finite direct variance at least 0.001 and replaces missing, nonfinite or strictly smaller values with GVF predictions; it does not replace large variances. This cutoff is an application policy requiring indicator/scale sensitivity checks. For log means it applies on the log-mean variance scale. Raw Direct uncertainty remains separate from these model inputs.</w:t>
+        <w:t xml:space="preserve">The same variance concept must scale the diagonal and off-diagonal. direct keeps raw design variances subject to explicit missing/zero safety backfills. sm_out is the default: it retains a finite direct variance at least 0.001 and replaces missing, nonfinite or strictly smaller values with GVF predictions; it does not replace large variances. This cutoff is an application policy requiring indicator/scale sensitivity checks. For log means it applies on the log-mean variance scale. Optional sm_all replaces all working variances with GVF predictions. Because the GVF uses sample size only, sm_all can overstate the variances of low-poverty areas; the guidelines (Section 6.6) discuss the choice. Raw Direct uncertainty remains separate from these model inputs.</w:t>
       </w:r>
       <w:proofErr w:type="gramStart"/>
       <w:r>
@@ -6977,7 +6977,7 @@
         </w:numPr>
       </w:pPr>
       <w:r>
-        <w:t xml:space="preserve">Use rho_sm_all with sm_all as the default when sampling dependence is plausible and domain covariances are noisy; assess the GVF fit and covariance assumptions.</w:t>
+        <w:t xml:space="preserve">Use rho_sm_out with sm_out as the default when sampling dependence is plausible and domain covariances are noisy. Its 0.001 cutoff is scale-specific and does not replace large variances.</w:t>
       </w:r>
       <w:r>
         <w:rPr>
@@ -6998,7 +6998,7 @@
         </w:numPr>
       </w:pPr>
       <w:r>
-        <w:t xml:space="preserve">Use rho_sm_out with sm_out as an optional sensitivity. Its unchanged 0.001 cutoff is scale-specific and does not replace large variances.</w:t>
+        <w:t xml:space="preserve">Use rho_sm_all with sm_all when direct variances are broadly unstable and the GVF fits well; assess the GVF fit and covariance assumptions.</w:t>
       </w:r>
       <w:r>
         <w:rPr>
@@ -7100,7 +7100,7 @@
         <w:pStyle w:val="BodyText"/>
       </w:pPr>
       <w:r>
-        <w:t xml:space="preserve">The dashboard offers matching variance–covariance choices (sm_all with rho_sm_all, sm_out with rho_sm_out, and direct with rho_dir), with direct and zero covariance also available. New configurations default to sm_all with rho_sm_all. An omitted covariance setting is derived from the effective variance choice; explicit saved choices are preserved. UFH also honors the selected variance option with log mean welfare, on the log-mean variance scale. Arcsine UFH retains its separate effective-sample-size analytical variance, with a fallback to observed sample size when its estimated effective sample size is invalid.</w:t>
+        <w:t xml:space="preserve">The dashboard offers matching variance–covariance choices (sm_out with rho_sm_out, sm_all with rho_sm_all, and direct with rho_dir), with direct and zero covariance also available. New configurations default to sm_out with rho_sm_out. An omitted covariance setting is derived from the effective variance choice; explicit saved choices are preserved. UFH also honors the selected variance option with log mean welfare, on the log-mean variance scale. Arcsine UFH retains its separate effective-sample-size analytical variance, with a fallback to observed sample size when its estimated effective sample size is invalid.</w:t>
       </w:r>
       <w:r>
         <w:rPr>

</xml_diff>